<commit_message>
docs: simplify frontend repo structure in plan
- Update AURA-PLAN.md and AURA-PLAN.docx to reflect root-level Next.js app
- Avoid unnecessary monorepo complexity inside the frontend repository
</commit_message>
<xml_diff>
--- a/AURA-PLAN.docx
+++ b/AURA-PLAN.docx
@@ -420,15 +420,15 @@
           <w:b w:val="0"/>
           <w:sz w:val="20"/>
         </w:rPr>
-        <w:t>apps/</w:t>
+        <w:t>app/              → Next.js App Router pages and layouts</w:t>
         <w:br/>
-        <w:t xml:space="preserve">  web/              → Next.js 14 App Router</w:t>
+        <w:t>components/       → Shared React components</w:t>
         <w:br/>
-        <w:t>packages/</w:t>
+        <w:t>lib/              → Utilities, hooks, API clients</w:t>
         <w:br/>
-        <w:t xml:space="preserve">  ui/               → Shared Tailwind + GSAP components</w:t>
+        <w:t>styles/           → Global CSS and Tailwind config</w:t>
         <w:br/>
-        <w:t xml:space="preserve">  config/           → ESLint, TypeScript, Tailwind presets</w:t>
+        <w:t>public/           → Static assets</w:t>
       </w:r>
     </w:p>
     <w:p>

</xml_diff>

<commit_message>
docs: align plan with actual Next.js 16 stack
- Update AURA-PLAN.md, AURA-PLAN.docx, and README.md to reflect Next.js 16, React 19, and Tailwind CSS v4
</commit_message>
<xml_diff>
--- a/AURA-PLAN.docx
+++ b/AURA-PLAN.docx
@@ -544,7 +544,7 @@
                 <w:b w:val="0"/>
                 <w:sz w:val="22"/>
               </w:rPr>
-              <w:t>Next.js 14 (App Router), React, TypeScript</w:t>
+              <w:t>Next.js 16 (App Router), React 19, TypeScript</w:t>
             </w:r>
           </w:p>
         </w:tc>
@@ -576,7 +576,7 @@
                 <w:b w:val="0"/>
                 <w:sz w:val="22"/>
               </w:rPr>
-              <w:t>Tailwind CSS with RTL-ready logical properties</w:t>
+              <w:t>Tailwind CSS v4 with RTL-ready logical properties</w:t>
             </w:r>
           </w:p>
         </w:tc>

</xml_diff>